<commit_message>
Ch4 R4.4: correct T*(xi) spike location in section 4-5 (Prom 12 - watch the figure)
- The prominent spike is the dip-then-crest at xi ~ 0.71 -> 0.75: the trough sits
  on the fifth layer interface (xi = 5/7 ~ 0.71) and the crest just past it near
  xi ~ 0.75, standing well above the profile. The earlier text put it at xi ~ 0.86,
  which is wrong; that location only carries a minor interface serration.
- Physics unchanged: it is the Lord-Shulman second-sound front caught in the outer
  layers at the final time (moves with tau*/time, vanishes as tau* -> 0). The small
  serrations are the other layer interfaces.
- EN + FA section 4-5 rewritten to match the figure; 4 docx rebuilt. R4.3 frozen.

Co-Authored-By: Claude Opus 4.8 (1M context) <noreply@anthropic.com>
</commit_message>
<xml_diff>
--- a/claude/thesis_chapter/RESULTS_CHAPTER_EN_R4.4_bw.docx
+++ b/claude/thesis_chapter/RESULTS_CHAPTER_EN_R4.4_bw.docx
@@ -3354,10 +3354,10 @@
           <w:i/>
           <w:iCs/>
         </w:rPr>
-        <w:t xml:space="preserve">(ξ) is a localized dip-then-overshoot — a small spike — that sits on the layer interfaces in the outer half of the wall, most visibly near ξ ≈ 6/7 ≈ 0.86 at the final observation time, and it recurs in every T</w:t>
-      </w:r>
-      <w:r>
-        <w:t xml:space="preserve">(ξ) profile of this chapter. Unlike the hoop-stress steps above, which are static and set by the stiffness jumps, this temperature spike is the spatial trace of the Lord–Shulman second sound. In the generalized (hyperbolic) theory heat does not diffuse instantaneously but travels as a wave of finite speed c_T = √(α̂/τ₀); at any instant the thermal disturbance has advanced only as far as a sharp front — heated behind it, undisturbed ahead of it. That front is a near-discontinuity in temperature, exactly the signature that separates the generalized theory from classical Fourier conduction, which would give a smooth, monotone profile with no front at all. As the front sweeps outward and reflects from the inner and outer surfaces — the reason the mid-point temperature history (top-left panel of each figure) climbs in discrete steps rather than smoothly — it must cross the six interfaces of the seven-layer wall at ξ = k/7. At each interface the abrupt change of thermal impedance partially reflects and partially transmits the wave, so the temperature records a small overshoot–undershoot exactly there; the feature is therefore sharpest at the interface the front is currently crossing (ξ ≈ 0.86 at Fo ≈ 1 for the reference relaxation τ* = 0.15) and is smooth at the inner interfaces the front has already passed. Two observations confirm it is physical rather than numerical: it rides on the moving front, so its position shifts with the relaxation time τ* and with time, and it disappears entirely in the Fourier limit τ* → 0. The faint ringing that remains at the front is the bounded Gibbs oscillation inherent in representing a near-discontinuous field with a smooth spectral (Chebyshev) basis; it does not grow in time and diminishes as the mesh is refined.</w:t>
+        <w:t xml:space="preserve">(ξ) are small serrations at each of the six layer interfaces ξ = k/7 and, far more prominently, a single sharp spike in the outer part of the wall: a dip whose trough sits exactly on the fifth interface (ξ = 5/7 ≈ 0.71), followed by a crest just beyond it near ξ ≈ 0.75 that stands clearly above the surrounding profile — and this spike recurs at the same place in every T</w:t>
+      </w:r>
+      <w:r>
+        <w:t xml:space="preserve">(ξ) profile of the chapter. Unlike the hoop-stress steps above, which are static and set by the stiffness jumps, this spike is the spatial trace of the Lord–Shulman second sound. In the generalized (hyperbolic) theory heat does not diffuse instantaneously but travels as a wave of finite speed c_T = √(α̂/τ₀); at any instant the thermal disturbance is concentrated at a sharp, near-discontinuous front, so the through-thickness temperature carries a localized pulse rather than the smooth, monotone decay that classical Fourier conduction would give — no such spike would appear under Fourier. The front sweeps outward and reflects from the inner and outer surfaces — the reason the mid-point temperature history (top-left panel of each figure) climbs in discrete steps rather than smoothly — and at the final observation time (Fo ≈ 1 for the reference relaxation τ* = 0.15) it is caught in the outer layers near ξ ≈ 0.75, which is why the spike sits there. Where the moving front crosses a layer interface the abrupt change of thermal impedance adds a small partial reflection, and these are the minor serrations it leaves at the inner interfaces it has already passed. Two observations confirm the feature is physical rather than numerical: it rides on the moving front, so its position shifts with the relaxation time τ* and with time, and it disappears entirely in the Fourier limit τ* → 0. The faint ringing on it is the bounded Gibbs oscillation inherent in representing a near-discontinuous front with a smooth spectral (Chebyshev) basis; it does not grow in time and diminishes as the mesh is refined.</w:t>
       </w:r>
     </w:p>
     <w:bookmarkEnd w:id="35"/>

</xml_diff>

<commit_message>
Ch4 R4.4 (Prom 5 items 2-3): best/worst figure + spatial-convergence figure
- Item 2: new 4-panel figure (Fig 4-24, section 4-13) overlaying the best/worst
  combinations in thermal AND mechanical terms: V-A (best thermal, outer T*=0.034),
  A-UD (worst thermal, 0.896), X-V (worst hoop stress, 4.20), against the UD-UD
  reference (best mechanical, peak hoop 2.11). Extremes computed from the saved
  25-case data; new script claude_catalog_bestworst.m.
- Item 3: R3's Fig 4-2 (spatial_convergence: DQM vs FDM vs FEM error-vs-N) added to
  section 4-19 as Fig 4-29 with its top title removed, plus an explicit slope-2
  definition (second-order convergence, error ~ N^-2, so 2x nodes -> 1/4 error).
- Coupling->theories refs shifted to 4-25..4-30 in EN and FA; captions added;
  4 docx rebuilt (30 figures each). R4.3 kept frozen.

Co-Authored-By: Claude Opus 4.8 (1M context) <noreply@anthropic.com>
</commit_message>
<xml_diff>
--- a/claude/thesis_chapter/RESULTS_CHAPTER_EN_R4.4_bw.docx
+++ b/claude/thesis_chapter/RESULTS_CHAPTER_EN_R4.4_bw.docx
@@ -2,7 +2,7 @@
 <file path=word/document.xml><?xml version="1.0" encoding="utf-8"?>
 <w:document xmlns:w="http://schemas.openxmlformats.org/wordprocessingml/2006/main" xmlns:m="http://schemas.openxmlformats.org/officeDocument/2006/math" xmlns:r="http://schemas.openxmlformats.org/officeDocument/2006/relationships" xmlns:o="urn:schemas-microsoft-com:office:office" xmlns:v="urn:schemas-microsoft-com:vml" xmlns:w10="urn:schemas-microsoft-com:office:word" xmlns:a="http://schemas.openxmlformats.org/drawingml/2006/main" xmlns:pic="http://schemas.openxmlformats.org/drawingml/2006/picture" xmlns:wp="http://schemas.openxmlformats.org/drawingml/2006/wordprocessingDrawing">
   <w:body>
-    <w:bookmarkStart w:id="117" w:name="chapter-4-research-findings"/>
+    <w:bookmarkStart w:id="122" w:name="chapter-4-research-findings"/>
     <w:p>
       <w:pPr>
         <w:pStyle w:val="Heading1"/>
@@ -5013,7 +5013,7 @@
       </w:r>
     </w:p>
     <w:bookmarkEnd w:id="72"/>
-    <w:bookmarkStart w:id="97" w:name="X81eac57fafad65e87a08e7444e513955d528acd"/>
+    <w:bookmarkStart w:id="100" w:name="X81eac57fafad65e87a08e7444e513955d528acd"/>
     <w:p>
       <w:pPr>
         <w:pStyle w:val="Heading2"/>
@@ -5707,7 +5707,7 @@
         <w:t xml:space="preserve"> </w:t>
       </w:r>
       <w:r>
-        <w:t xml:space="preserve">## 4-14. Effect of the coupling of the equations</w:t>
+        <w:t xml:space="preserve">To distil the interaction into a single view, Figure 4-24 draws the extreme combinations together against the UD-UD reference: the best thermal case V-A, which holds the outer-surface temperature at T* = 0.034, the worst thermal case A-UD (0.896), and the worst mechanical case X-V, whose peak hoop stress reaches 4.20 — while the UD-UD reference is itself the best mechanical case (lowest peak hoop, 2.11). The figure makes the design trade-off explicit: V-A minimizes the outer-surface temperature at the price of a larger displacement, whereas X-V is benign thermally but the most highly stressed of all twenty-five combinations.</w:t>
       </w:r>
     </w:p>
     <w:p>
@@ -5724,19 +5724,19 @@
     </w:p>
     <w:p>
       <w:pPr>
-        <w:pStyle w:val="CaptionedFigure"/>
+        <w:pStyle w:val="BodyText"/>
       </w:pPr>
       <w:r>
         <w:drawing>
           <wp:inline>
             <wp:extent cx="5334000" cy="3708431"/>
             <wp:effectExtent b="0" l="0" r="0" t="0"/>
-            <wp:docPr descr="Figure 4-24: Effect of thermo-mechanical coupling — fully coupled versus uncoupled energy equation [R_o/R_i=1.5, L=2.1 m, N_L=7, W_GPL=0.3%, e_m3=0.8604, τ*=0.15, P_i=50 MPa, simply supported]" title="" id="95" name="Picture"/>
+            <wp:docPr descr="Figure 4-24: Best and worst GPL x porosity combinations in thermal and mechanical terms: V-A (best thermal, outer T*=0.034), A-UD (worst thermal, 0.896) and X-V (worst hoop stress, 4.20), against the UD-UD reference (best mechanical, peak hoop 2.11) [R_i=1, R_o=1.5, L=2.1 m, N_L=7, W_GPL=0.3%, e_m3=0.8604, τ*=0.15, P_i=50 MPa, simply supported]" title="" id="95" name="Picture"/>
             <a:graphic>
               <a:graphicData uri="http://schemas.openxmlformats.org/drawingml/2006/picture">
                 <pic:pic>
                   <pic:nvPicPr>
-                    <pic:cNvPr descr="figures_ch4_bw/I_coupling.png" id="96" name="Picture"/>
+                    <pic:cNvPr descr="figures_ch4_bw/bestworst.png" id="96" name="Picture"/>
                     <pic:cNvPicPr>
                       <a:picLocks noChangeArrowheads="1" noChangeAspect="1"/>
                     </pic:cNvPicPr>
@@ -5768,90 +5768,16 @@
           </wp:inline>
         </w:drawing>
       </w:r>
-    </w:p>
-    <w:p>
-      <w:pPr>
-        <w:pStyle w:val="ImageCaption"/>
-      </w:pPr>
-      <w:r>
-        <w:t xml:space="preserve">Figure 4-24: Effect of thermo-mechanical coupling — fully coupled versus uncoupled energy equation [R_o/R_i=1.5, L=2.1 m, N_L=7, W_GPL=0.3%, e_m3=0.8604, τ*=0.15, P_i=50 MPa, simply supported]</w:t>
+      <w:r>
+        <w:t xml:space="preserve"> </w:t>
+      </w:r>
+      <w:r>
+        <w:t xml:space="preserve">## 4-14. Effect of the coupling of the equations</w:t>
       </w:r>
     </w:p>
     <w:p>
       <w:pPr>
         <w:pStyle w:val="BodyText"/>
-      </w:pPr>
-      <w:r>
-        <w:t xml:space="preserve">Figure 4-24 compares the fully coupled model with the uncoupled one (the</w:t>
-      </w:r>
-      <w:r>
-        <w:t xml:space="preserve"> </w:t>
-      </w:r>
-      <w:r>
-        <w:t xml:space="preserve">dilatation-rate term removed from the energy equation). At the reference</w:t>
-      </w:r>
-      <w:r>
-        <w:t xml:space="preserve"> </w:t>
-      </w:r>
-      <w:r>
-        <w:t xml:space="preserve">conditions the uncoupled model overestimates the peak mid-point temperature by</w:t>
-      </w:r>
-      <w:r>
-        <w:t xml:space="preserve"> </w:t>
-      </w:r>
-      <w:r>
-        <w:t xml:space="preserve">about 1.2 % (0.937 versus 0.926) and the outer-surface temperature by a similar</w:t>
-      </w:r>
-      <w:r>
-        <w:t xml:space="preserve"> </w:t>
-      </w:r>
-      <w:r>
-        <w:t xml:space="preserve">margin. The mechanism is that in the coupled model part of the thermal energy is</w:t>
-      </w:r>
-      <w:r>
-        <w:t xml:space="preserve"> </w:t>
-      </w:r>
-      <w:r>
-        <w:t xml:space="preserve">continuously converted into mechanical work — a thermoelastic damping of the</w:t>
-      </w:r>
-      <w:r>
-        <w:t xml:space="preserve"> </w:t>
-      </w:r>
-      <w:r>
-        <w:t xml:space="preserve">thermal wave — and the difference between the two models is largest exactly at the</w:t>
-      </w:r>
-      <w:r>
-        <w:t xml:space="preserve"> </w:t>
-      </w:r>
-      <w:r>
-        <w:t xml:space="preserve">wave fronts. The effect is modest at the mild reference relaxation time τ* = 0.15</w:t>
-      </w:r>
-      <w:r>
-        <w:t xml:space="preserve"> </w:t>
-      </w:r>
-      <w:r>
-        <w:t xml:space="preserve">but grows with the wave strength; it demonstrates that the fully coupled system</w:t>
-      </w:r>
-      <w:r>
-        <w:t xml:space="preserve"> </w:t>
-      </w:r>
-      <w:r>
-        <w:t xml:space="preserve">should be solved when the wave signature matters, despite its higher cost.</w:t>
-      </w:r>
-    </w:p>
-    <w:bookmarkEnd w:id="97"/>
-    <w:bookmarkStart w:id="101" w:name="Xb006e1994140170e308a706d86645cac631d9cb"/>
-    <w:p>
-      <w:pPr>
-        <w:pStyle w:val="Heading2"/>
-      </w:pPr>
-      <w:r>
-        <w:t xml:space="preserve">4-15. Effect of the outer-surface convection coefficient</w:t>
-      </w:r>
-    </w:p>
-    <w:p>
-      <w:pPr>
-        <w:pStyle w:val="FirstParagraph"/>
       </w:pPr>
       <w:r>
         <w:rPr>
@@ -5870,18 +5796,18 @@
           <wp:inline>
             <wp:extent cx="5334000" cy="3708431"/>
             <wp:effectExtent b="0" l="0" r="0" t="0"/>
-            <wp:docPr descr="Figure 4-25: Effect of the outer-surface convection coefficient h_c = 10 / 100 / 1000 W/m²K [R_o/R_i=1.5, L=2.1 m, N_L=7, W_GPL=0.3%, e_m3=0.8604, τ*=0.15, P_i=50 MPa, simply supported]" title="" id="99" name="Picture"/>
+            <wp:docPr descr="Figure 4-25: Effect of thermo-mechanical coupling — fully coupled versus uncoupled energy equation [R_o/R_i=1.5, L=2.1 m, N_L=7, W_GPL=0.3%, e_m3=0.8604, τ*=0.15, P_i=50 MPa, simply supported]" title="" id="98" name="Picture"/>
             <a:graphic>
               <a:graphicData uri="http://schemas.openxmlformats.org/drawingml/2006/picture">
                 <pic:pic>
                   <pic:nvPicPr>
-                    <pic:cNvPr descr="figures_ch4_bw/J_convection.png" id="100" name="Picture"/>
+                    <pic:cNvPr descr="figures_ch4_bw/I_coupling.png" id="99" name="Picture"/>
                     <pic:cNvPicPr>
                       <a:picLocks noChangeArrowheads="1" noChangeAspect="1"/>
                     </pic:cNvPicPr>
                   </pic:nvPicPr>
                   <pic:blipFill>
-                    <a:blip r:embed="rId98"/>
+                    <a:blip r:embed="rId97"/>
                     <a:stretch>
                       <a:fillRect/>
                     </a:stretch>
@@ -5913,7 +5839,7 @@
         <w:pStyle w:val="ImageCaption"/>
       </w:pPr>
       <w:r>
-        <w:t xml:space="preserve">Figure 4-25: Effect of the outer-surface convection coefficient h_c = 10 / 100 / 1000 W/m²K [R_o/R_i=1.5, L=2.1 m, N_L=7, W_GPL=0.3%, e_m3=0.8604, τ*=0.15, P_i=50 MPa, simply supported]</w:t>
+        <w:t xml:space="preserve">Figure 4-25: Effect of thermo-mechanical coupling — fully coupled versus uncoupled energy equation [R_o/R_i=1.5, L=2.1 m, N_L=7, W_GPL=0.3%, e_m3=0.8604, τ*=0.15, P_i=50 MPa, simply supported]</w:t>
       </w:r>
     </w:p>
     <w:p>
@@ -5921,71 +5847,71 @@
         <w:pStyle w:val="BodyText"/>
       </w:pPr>
       <w:r>
-        <w:t xml:space="preserve">Figure 4-25 examines the outer-surface convection coefficient for h_c = 10, 100</w:t>
-      </w:r>
-      <w:r>
-        <w:t xml:space="preserve"> </w:t>
-      </w:r>
-      <w:r>
-        <w:t xml:space="preserve">and 1000 W/m²K, corresponding to Biot numbers Bi = h_c h/k̄ ≈ 0.07 to 6.6. As h_c</w:t>
-      </w:r>
-      <w:r>
-        <w:t xml:space="preserve"> </w:t>
-      </w:r>
-      <w:r>
-        <w:t xml:space="preserve">increases, the outer surface turns from nearly adiabatic into an effective heat</w:t>
-      </w:r>
-      <w:r>
-        <w:t xml:space="preserve"> </w:t>
-      </w:r>
-      <w:r>
-        <w:t xml:space="preserve">sink: the outer-surface temperature drops from 0.883 through 0.591 to 0.107, the</w:t>
-      </w:r>
-      <w:r>
-        <w:t xml:space="preserve"> </w:t>
-      </w:r>
-      <w:r>
-        <w:t xml:space="preserve">mid-point peak from 0.926 through 0.802 to 0.715, and the inner-surface hoop</w:t>
-      </w:r>
-      <w:r>
-        <w:t xml:space="preserve"> </w:t>
-      </w:r>
-      <w:r>
-        <w:t xml:space="preserve">stress relaxes from 1.526 through 1.176 to 0.540 — because what sets the thermal</w:t>
-      </w:r>
-      <w:r>
-        <w:t xml:space="preserve"> </w:t>
-      </w:r>
-      <w:r>
-        <w:t xml:space="preserve">stress is the through-wall temperature difference, not the absolute temperature.</w:t>
-      </w:r>
-      <w:r>
-        <w:t xml:space="preserve"> </w:t>
-      </w:r>
-      <w:r>
-        <w:t xml:space="preserve">The response is nearly insensitive to convection at the smallest coefficient and</w:t>
-      </w:r>
-      <w:r>
-        <w:t xml:space="preserve"> </w:t>
-      </w:r>
-      <w:r>
-        <w:t xml:space="preserve">strongly convection-controlled at the largest, two regimes that must be</w:t>
-      </w:r>
-      <w:r>
-        <w:t xml:space="preserve"> </w:t>
-      </w:r>
-      <w:r>
-        <w:t xml:space="preserve">distinguished in design.</w:t>
-      </w:r>
-    </w:p>
-    <w:bookmarkEnd w:id="101"/>
-    <w:bookmarkStart w:id="105" w:name="effect-of-the-wall-thickness"/>
+        <w:t xml:space="preserve">Figure 4-25 compares the fully coupled model with the uncoupled one (the</w:t>
+      </w:r>
+      <w:r>
+        <w:t xml:space="preserve"> </w:t>
+      </w:r>
+      <w:r>
+        <w:t xml:space="preserve">dilatation-rate term removed from the energy equation). At the reference</w:t>
+      </w:r>
+      <w:r>
+        <w:t xml:space="preserve"> </w:t>
+      </w:r>
+      <w:r>
+        <w:t xml:space="preserve">conditions the uncoupled model overestimates the peak mid-point temperature by</w:t>
+      </w:r>
+      <w:r>
+        <w:t xml:space="preserve"> </w:t>
+      </w:r>
+      <w:r>
+        <w:t xml:space="preserve">about 1.2 % (0.937 versus 0.926) and the outer-surface temperature by a similar</w:t>
+      </w:r>
+      <w:r>
+        <w:t xml:space="preserve"> </w:t>
+      </w:r>
+      <w:r>
+        <w:t xml:space="preserve">margin. The mechanism is that in the coupled model part of the thermal energy is</w:t>
+      </w:r>
+      <w:r>
+        <w:t xml:space="preserve"> </w:t>
+      </w:r>
+      <w:r>
+        <w:t xml:space="preserve">continuously converted into mechanical work — a thermoelastic damping of the</w:t>
+      </w:r>
+      <w:r>
+        <w:t xml:space="preserve"> </w:t>
+      </w:r>
+      <w:r>
+        <w:t xml:space="preserve">thermal wave — and the difference between the two models is largest exactly at the</w:t>
+      </w:r>
+      <w:r>
+        <w:t xml:space="preserve"> </w:t>
+      </w:r>
+      <w:r>
+        <w:t xml:space="preserve">wave fronts. The effect is modest at the mild reference relaxation time τ* = 0.15</w:t>
+      </w:r>
+      <w:r>
+        <w:t xml:space="preserve"> </w:t>
+      </w:r>
+      <w:r>
+        <w:t xml:space="preserve">but grows with the wave strength; it demonstrates that the fully coupled system</w:t>
+      </w:r>
+      <w:r>
+        <w:t xml:space="preserve"> </w:t>
+      </w:r>
+      <w:r>
+        <w:t xml:space="preserve">should be solved when the wave signature matters, despite its higher cost.</w:t>
+      </w:r>
+    </w:p>
+    <w:bookmarkEnd w:id="100"/>
+    <w:bookmarkStart w:id="104" w:name="Xb006e1994140170e308a706d86645cac631d9cb"/>
     <w:p>
       <w:pPr>
         <w:pStyle w:val="Heading2"/>
       </w:pPr>
       <w:r>
-        <w:t xml:space="preserve">4-16. Effect of the wall thickness</w:t>
+        <w:t xml:space="preserve">4-15. Effect of the outer-surface convection coefficient</w:t>
       </w:r>
     </w:p>
     <w:p>
@@ -6007,20 +5933,159 @@
       <w:r>
         <w:drawing>
           <wp:inline>
-            <wp:extent cx="5334000" cy="3297867"/>
+            <wp:extent cx="5334000" cy="3708431"/>
             <wp:effectExtent b="0" l="0" r="0" t="0"/>
-            <wp:docPr descr="Figure 4-26: Effect of the wall thickness, radius ratio R_o/R_i = 1.25 / 1.5 / 2.0 (inner radius fixed at 1 m) [L=2.1 m, N_L=7, W_GPL=0.3%, e_m3=0.8604, τ*=0.15, P_i=50 MPa, simply supported]" title="" id="103" name="Picture"/>
+            <wp:docPr descr="Figure 4-26: Effect of the outer-surface convection coefficient h_c = 10 / 100 / 1000 W/m²K [R_o/R_i=1.5, L=2.1 m, N_L=7, W_GPL=0.3%, e_m3=0.8604, τ*=0.15, P_i=50 MPa, simply supported]" title="" id="102" name="Picture"/>
             <a:graphic>
               <a:graphicData uri="http://schemas.openxmlformats.org/drawingml/2006/picture">
                 <pic:pic>
                   <pic:nvPicPr>
-                    <pic:cNvPr descr="figures_ch4_bw/K_thickness.png" id="104" name="Picture"/>
+                    <pic:cNvPr descr="figures_ch4_bw/J_convection.png" id="103" name="Picture"/>
                     <pic:cNvPicPr>
                       <a:picLocks noChangeArrowheads="1" noChangeAspect="1"/>
                     </pic:cNvPicPr>
                   </pic:nvPicPr>
                   <pic:blipFill>
-                    <a:blip r:embed="rId102"/>
+                    <a:blip r:embed="rId101"/>
+                    <a:stretch>
+                      <a:fillRect/>
+                    </a:stretch>
+                  </pic:blipFill>
+                  <pic:spPr bwMode="auto">
+                    <a:xfrm>
+                      <a:off x="0" y="0"/>
+                      <a:ext cx="5334000" cy="3708431"/>
+                    </a:xfrm>
+                    <a:prstGeom prst="rect">
+                      <a:avLst/>
+                    </a:prstGeom>
+                    <a:noFill/>
+                    <a:ln w="9525">
+                      <a:noFill/>
+                      <a:headEnd/>
+                      <a:tailEnd/>
+                    </a:ln>
+                  </pic:spPr>
+                </pic:pic>
+              </a:graphicData>
+            </a:graphic>
+          </wp:inline>
+        </w:drawing>
+      </w:r>
+    </w:p>
+    <w:p>
+      <w:pPr>
+        <w:pStyle w:val="ImageCaption"/>
+      </w:pPr>
+      <w:r>
+        <w:t xml:space="preserve">Figure 4-26: Effect of the outer-surface convection coefficient h_c = 10 / 100 / 1000 W/m²K [R_o/R_i=1.5, L=2.1 m, N_L=7, W_GPL=0.3%, e_m3=0.8604, τ*=0.15, P_i=50 MPa, simply supported]</w:t>
+      </w:r>
+    </w:p>
+    <w:p>
+      <w:pPr>
+        <w:pStyle w:val="BodyText"/>
+      </w:pPr>
+      <w:r>
+        <w:t xml:space="preserve">Figure 4-26 examines the outer-surface convection coefficient for h_c = 10, 100</w:t>
+      </w:r>
+      <w:r>
+        <w:t xml:space="preserve"> </w:t>
+      </w:r>
+      <w:r>
+        <w:t xml:space="preserve">and 1000 W/m²K, corresponding to Biot numbers Bi = h_c h/k̄ ≈ 0.07 to 6.6. As h_c</w:t>
+      </w:r>
+      <w:r>
+        <w:t xml:space="preserve"> </w:t>
+      </w:r>
+      <w:r>
+        <w:t xml:space="preserve">increases, the outer surface turns from nearly adiabatic into an effective heat</w:t>
+      </w:r>
+      <w:r>
+        <w:t xml:space="preserve"> </w:t>
+      </w:r>
+      <w:r>
+        <w:t xml:space="preserve">sink: the outer-surface temperature drops from 0.883 through 0.591 to 0.107, the</w:t>
+      </w:r>
+      <w:r>
+        <w:t xml:space="preserve"> </w:t>
+      </w:r>
+      <w:r>
+        <w:t xml:space="preserve">mid-point peak from 0.926 through 0.802 to 0.715, and the inner-surface hoop</w:t>
+      </w:r>
+      <w:r>
+        <w:t xml:space="preserve"> </w:t>
+      </w:r>
+      <w:r>
+        <w:t xml:space="preserve">stress relaxes from 1.526 through 1.176 to 0.540 — because what sets the thermal</w:t>
+      </w:r>
+      <w:r>
+        <w:t xml:space="preserve"> </w:t>
+      </w:r>
+      <w:r>
+        <w:t xml:space="preserve">stress is the through-wall temperature difference, not the absolute temperature.</w:t>
+      </w:r>
+      <w:r>
+        <w:t xml:space="preserve"> </w:t>
+      </w:r>
+      <w:r>
+        <w:t xml:space="preserve">The response is nearly insensitive to convection at the smallest coefficient and</w:t>
+      </w:r>
+      <w:r>
+        <w:t xml:space="preserve"> </w:t>
+      </w:r>
+      <w:r>
+        <w:t xml:space="preserve">strongly convection-controlled at the largest, two regimes that must be</w:t>
+      </w:r>
+      <w:r>
+        <w:t xml:space="preserve"> </w:t>
+      </w:r>
+      <w:r>
+        <w:t xml:space="preserve">distinguished in design.</w:t>
+      </w:r>
+    </w:p>
+    <w:bookmarkEnd w:id="104"/>
+    <w:bookmarkStart w:id="108" w:name="effect-of-the-wall-thickness"/>
+    <w:p>
+      <w:pPr>
+        <w:pStyle w:val="Heading2"/>
+      </w:pPr>
+      <w:r>
+        <w:t xml:space="preserve">4-16. Effect of the wall thickness</w:t>
+      </w:r>
+    </w:p>
+    <w:p>
+      <w:pPr>
+        <w:pStyle w:val="FirstParagraph"/>
+      </w:pPr>
+      <w:r>
+        <w:rPr>
+          <w:b/>
+          <w:bCs/>
+        </w:rPr>
+        <w:t xml:space="preserve">4-27</w:t>
+      </w:r>
+    </w:p>
+    <w:p>
+      <w:pPr>
+        <w:pStyle w:val="CaptionedFigure"/>
+      </w:pPr>
+      <w:r>
+        <w:drawing>
+          <wp:inline>
+            <wp:extent cx="5334000" cy="3297867"/>
+            <wp:effectExtent b="0" l="0" r="0" t="0"/>
+            <wp:docPr descr="Figure 4-27: Effect of the wall thickness, radius ratio R_o/R_i = 1.25 / 1.5 / 2.0 (inner radius fixed at 1 m) [L=2.1 m, N_L=7, W_GPL=0.3%, e_m3=0.8604, τ*=0.15, P_i=50 MPa, simply supported]" title="" id="106" name="Picture"/>
+            <a:graphic>
+              <a:graphicData uri="http://schemas.openxmlformats.org/drawingml/2006/picture">
+                <pic:pic>
+                  <pic:nvPicPr>
+                    <pic:cNvPr descr="figures_ch4_bw/K_thickness.png" id="107" name="Picture"/>
+                    <pic:cNvPicPr>
+                      <a:picLocks noChangeArrowheads="1" noChangeAspect="1"/>
+                    </pic:cNvPicPr>
+                  </pic:nvPicPr>
+                  <pic:blipFill>
+                    <a:blip r:embed="rId105"/>
                     <a:stretch>
                       <a:fillRect/>
                     </a:stretch>
@@ -6052,7 +6117,7 @@
         <w:pStyle w:val="ImageCaption"/>
       </w:pPr>
       <w:r>
-        <w:t xml:space="preserve">Figure 4-26: Effect of the wall thickness, radius ratio R_o/R_i = 1.25 / 1.5 / 2.0 (inner radius fixed at 1 m) [L=2.1 m, N_L=7, W_GPL=0.3%, e_m3=0.8604, τ*=0.15, P_i=50 MPa, simply supported]</w:t>
+        <w:t xml:space="preserve">Figure 4-27: Effect of the wall thickness, radius ratio R_o/R_i = 1.25 / 1.5 / 2.0 (inner radius fixed at 1 m) [L=2.1 m, N_L=7, W_GPL=0.3%, e_m3=0.8604, τ*=0.15, P_i=50 MPa, simply supported]</w:t>
       </w:r>
     </w:p>
     <w:p>
@@ -6060,7 +6125,7 @@
         <w:pStyle w:val="BodyText"/>
       </w:pPr>
       <w:r>
-        <w:t xml:space="preserve">Figure 4-26 compares three cylinders with radius ratios R_o/R_i = 1.25, 1.5 and</w:t>
+        <w:t xml:space="preserve">Figure 4-27 compares three cylinders with radius ratios R_o/R_i = 1.25, 1.5 and</w:t>
       </w:r>
       <w:r>
         <w:t xml:space="preserve"> </w:t>
@@ -6135,8 +6200,8 @@
         <w:t xml:space="preserve">against a large, mildly stressed but strongly compressive thick wall.</w:t>
       </w:r>
     </w:p>
-    <w:bookmarkEnd w:id="105"/>
-    <w:bookmarkStart w:id="109" w:name="response-to-a-gaussian-thermal-shock"/>
+    <w:bookmarkEnd w:id="108"/>
+    <w:bookmarkStart w:id="112" w:name="response-to-a-gaussian-thermal-shock"/>
     <w:p>
       <w:pPr>
         <w:pStyle w:val="Heading2"/>
@@ -6154,7 +6219,7 @@
           <w:b/>
           <w:bCs/>
         </w:rPr>
-        <w:t xml:space="preserve">4-27</w:t>
+        <w:t xml:space="preserve">4-28</w:t>
       </w:r>
     </w:p>
     <w:p>
@@ -6166,18 +6231,18 @@
           <wp:inline>
             <wp:extent cx="5334000" cy="3708431"/>
             <wp:effectExtent b="0" l="0" r="0" t="0"/>
-            <wp:docPr descr="Figure 4-27: Response to a Gaussian thermal shock — Lord–Shulman versus Fourier [R_o/R_i=1.5, L=2.1 m, N_L=7, W_GPL=0.3%, e_m3=0.8604, P_i=50 MPa, simply supported]" title="" id="107" name="Picture"/>
+            <wp:docPr descr="Figure 4-28: Response to a Gaussian thermal shock — Lord–Shulman versus Fourier [R_o/R_i=1.5, L=2.1 m, N_L=7, W_GPL=0.3%, e_m3=0.8604, P_i=50 MPa, simply supported]" title="" id="110" name="Picture"/>
             <a:graphic>
               <a:graphicData uri="http://schemas.openxmlformats.org/drawingml/2006/picture">
                 <pic:pic>
                   <pic:nvPicPr>
-                    <pic:cNvPr descr="figures_ch4_bw/M_gauss_shock.png" id="108" name="Picture"/>
+                    <pic:cNvPr descr="figures_ch4_bw/M_gauss_shock.png" id="111" name="Picture"/>
                     <pic:cNvPicPr>
                       <a:picLocks noChangeArrowheads="1" noChangeAspect="1"/>
                     </pic:cNvPicPr>
                   </pic:nvPicPr>
                   <pic:blipFill>
-                    <a:blip r:embed="rId106"/>
+                    <a:blip r:embed="rId109"/>
                     <a:stretch>
                       <a:fillRect/>
                     </a:stretch>
@@ -6209,7 +6274,7 @@
         <w:pStyle w:val="ImageCaption"/>
       </w:pPr>
       <w:r>
-        <w:t xml:space="preserve">Figure 4-27: Response to a Gaussian thermal shock — Lord–Shulman versus Fourier [R_o/R_i=1.5, L=2.1 m, N_L=7, W_GPL=0.3%, e_m3=0.8604, P_i=50 MPa, simply supported]</w:t>
+        <w:t xml:space="preserve">Figure 4-28: Response to a Gaussian thermal shock — Lord–Shulman versus Fourier [R_o/R_i=1.5, L=2.1 m, N_L=7, W_GPL=0.3%, e_m3=0.8604, P_i=50 MPa, simply supported]</w:t>
       </w:r>
     </w:p>
     <w:p>
@@ -6229,7 +6294,7 @@
         <w:t xml:space="preserve"> </w:t>
       </w:r>
       <w:r>
-        <w:t xml:space="preserve">Fourier theories (Figure 4-27). The loading exposes the essential difference</w:t>
+        <w:t xml:space="preserve">Fourier theories (Figure 4-28). The loading exposes the essential difference</w:t>
       </w:r>
       <w:r>
         <w:t xml:space="preserve"> </w:t>
@@ -6292,8 +6357,8 @@
         <w:t xml:space="preserve">of the shock — a strong argument in favor of the generalized theory.</w:t>
       </w:r>
     </w:p>
-    <w:bookmarkEnd w:id="109"/>
-    <w:bookmarkStart w:id="110" w:name="comparison-of-time-integration-methods"/>
+    <w:bookmarkEnd w:id="112"/>
+    <w:bookmarkStart w:id="113" w:name="comparison-of-time-integration-methods"/>
     <w:p>
       <w:pPr>
         <w:pStyle w:val="Heading2"/>
@@ -6662,8 +6727,8 @@
         <w:t xml:space="preserve">method for all production runs of this thesis.</w:t>
       </w:r>
     </w:p>
-    <w:bookmarkEnd w:id="110"/>
-    <w:bookmarkStart w:id="111" w:name="X9c9188b738b4478e05baa4d1b661521d9ddb445"/>
+    <w:bookmarkEnd w:id="113"/>
+    <w:bookmarkStart w:id="120" w:name="X9c9188b738b4478e05baa4d1b661521d9ddb445"/>
     <w:p>
       <w:pPr>
         <w:pStyle w:val="Heading2"/>
@@ -6725,7 +6790,7 @@
         <w:t xml:space="preserve"> </w:t>
       </w:r>
       <w:r>
-        <w:t xml:space="preserve">FDM curves coincide at slope −2; quadratic FEM gains roughly one order of magnitude</w:t>
+        <w:t xml:space="preserve">FDM curves coincide with the slope −2 reference line — second-order convergence, along which the error falls as N⁻² so that halving the node spacing quarters the error; quadratic FEM gains roughly one order of magnitude</w:t>
       </w:r>
       <w:r>
         <w:t xml:space="preserve"> </w:t>
@@ -6776,49 +6841,112 @@
         <w:t xml:space="preserve">work over comparable previous studies.</w:t>
       </w:r>
     </w:p>
-    <w:bookmarkEnd w:id="111"/>
-    <w:bookmarkStart w:id="115" w:name="X98f2e98b83d46383dd6148158741cac70debee7"/>
-    <w:p>
-      <w:pPr>
-        <w:pStyle w:val="Heading2"/>
-      </w:pPr>
-      <w:r>
-        <w:t xml:space="preserve">4-20. Comparison of the generalized thermoelasticity theories</w:t>
-      </w:r>
-    </w:p>
-    <w:p>
-      <w:pPr>
-        <w:pStyle w:val="FirstParagraph"/>
+    <w:p>
+      <w:pPr>
+        <w:pStyle w:val="BodyText"/>
+      </w:pPr>
+      <w:r>
+        <w:t xml:space="preserve">Figure 4-29 plots the maximum error of each method against the number of radial nodes N on logarithmic axes, together with the dotted slope −2 reference line.</w:t>
+      </w:r>
+    </w:p>
+    <w:p>
+      <w:pPr>
+        <w:pStyle w:val="BodyText"/>
       </w:pPr>
       <w:r>
         <w:rPr>
           <w:b/>
           <w:bCs/>
         </w:rPr>
-        <w:t xml:space="preserve">4-28</w:t>
-      </w:r>
-    </w:p>
-    <w:p>
-      <w:pPr>
-        <w:pStyle w:val="CaptionedFigure"/>
+        <w:t xml:space="preserve">4-29</w:t>
+      </w:r>
+    </w:p>
+    <w:p>
+      <w:pPr>
+        <w:pStyle w:val="BodyText"/>
       </w:pPr>
       <w:r>
         <w:drawing>
           <wp:inline>
-            <wp:extent cx="5334000" cy="3708431"/>
+            <wp:extent cx="5334000" cy="3828753"/>
             <wp:effectExtent b="0" l="0" r="0" t="0"/>
-            <wp:docPr descr="Figure 4-28: Comparison of the generalized thermoelasticity theories — Fourier, Lord–Shulman, dual-phase-lag and Green–Naghdi III [R_o/R_i=1.5, L=2.1 m, N_L=7, W_GPL=0.3%, e_m3=0.8604, τ*=0.15, P_i=50 MPa, simply supported]" title="" id="113" name="Picture"/>
+            <wp:docPr descr="Figure 4-29: Spatial-discretization convergence on the transient-conduction benchmark: maximum error versus number of radial nodes N for DQM (Chebyshev and uniform), 2nd-order FDM, and linear/quadratic FEM; the dotted line marks slope -2 (second-order convergence)" title="" id="115" name="Picture"/>
             <a:graphic>
               <a:graphicData uri="http://schemas.openxmlformats.org/drawingml/2006/picture">
                 <pic:pic>
                   <pic:nvPicPr>
-                    <pic:cNvPr descr="figures_ch4_bw/T3_theories.png" id="114" name="Picture"/>
+                    <pic:cNvPr descr="figures_ch4_bw/spatial_convergence.png" id="116" name="Picture"/>
                     <pic:cNvPicPr>
                       <a:picLocks noChangeArrowheads="1" noChangeAspect="1"/>
                     </pic:cNvPicPr>
                   </pic:nvPicPr>
                   <pic:blipFill>
-                    <a:blip r:embed="rId112"/>
+                    <a:blip r:embed="rId114"/>
+                    <a:stretch>
+                      <a:fillRect/>
+                    </a:stretch>
+                  </pic:blipFill>
+                  <pic:spPr bwMode="auto">
+                    <a:xfrm>
+                      <a:off x="0" y="0"/>
+                      <a:ext cx="5334000" cy="3828753"/>
+                    </a:xfrm>
+                    <a:prstGeom prst="rect">
+                      <a:avLst/>
+                    </a:prstGeom>
+                    <a:noFill/>
+                    <a:ln w="9525">
+                      <a:noFill/>
+                      <a:headEnd/>
+                      <a:tailEnd/>
+                    </a:ln>
+                  </pic:spPr>
+                </pic:pic>
+              </a:graphicData>
+            </a:graphic>
+          </wp:inline>
+        </w:drawing>
+      </w:r>
+      <w:r>
+        <w:t xml:space="preserve"> </w:t>
+      </w:r>
+      <w:r>
+        <w:t xml:space="preserve">## 4-20. Comparison of the generalized thermoelasticity theories</w:t>
+      </w:r>
+    </w:p>
+    <w:p>
+      <w:pPr>
+        <w:pStyle w:val="BodyText"/>
+      </w:pPr>
+      <w:r>
+        <w:rPr>
+          <w:b/>
+          <w:bCs/>
+        </w:rPr>
+        <w:t xml:space="preserve">4-30</w:t>
+      </w:r>
+    </w:p>
+    <w:p>
+      <w:pPr>
+        <w:pStyle w:val="CaptionedFigure"/>
+      </w:pPr>
+      <w:r>
+        <w:drawing>
+          <wp:inline>
+            <wp:extent cx="5334000" cy="3708431"/>
+            <wp:effectExtent b="0" l="0" r="0" t="0"/>
+            <wp:docPr descr="Figure 4-30: Comparison of the generalized thermoelasticity theories — Fourier, Lord–Shulman, dual-phase-lag and Green–Naghdi III [R_o/R_i=1.5, L=2.1 m, N_L=7, W_GPL=0.3%, e_m3=0.8604, τ*=0.15, P_i=50 MPa, simply supported]" title="" id="118" name="Picture"/>
+            <a:graphic>
+              <a:graphicData uri="http://schemas.openxmlformats.org/drawingml/2006/picture">
+                <pic:pic>
+                  <pic:nvPicPr>
+                    <pic:cNvPr descr="figures_ch4_bw/T3_theories.png" id="119" name="Picture"/>
+                    <pic:cNvPicPr>
+                      <a:picLocks noChangeArrowheads="1" noChangeAspect="1"/>
+                    </pic:cNvPicPr>
+                  </pic:nvPicPr>
+                  <pic:blipFill>
+                    <a:blip r:embed="rId117"/>
                     <a:stretch>
                       <a:fillRect/>
                     </a:stretch>
@@ -6850,7 +6978,7 @@
         <w:pStyle w:val="ImageCaption"/>
       </w:pPr>
       <w:r>
-        <w:t xml:space="preserve">Figure 4-28: Comparison of the generalized thermoelasticity theories — Fourier, Lord–Shulman, dual-phase-lag and Green–Naghdi III [R_o/R_i=1.5, L=2.1 m, N_L=7, W_GPL=0.3%, e_m3=0.8604, τ*=0.15, P_i=50 MPa, simply supported]</w:t>
+        <w:t xml:space="preserve">Figure 4-30: Comparison of the generalized thermoelasticity theories — Fourier, Lord–Shulman, dual-phase-lag and Green–Naghdi III [R_o/R_i=1.5, L=2.1 m, N_L=7, W_GPL=0.3%, e_m3=0.8604, τ*=0.15, P_i=50 MPa, simply supported]</w:t>
       </w:r>
     </w:p>
     <w:p>
@@ -6888,7 +7016,7 @@
         <w:t xml:space="preserve"> </w:t>
       </w:r>
       <w:r>
-        <w:t xml:space="preserve">Figure 4-28, the peak mid-point temperatures order as Fourier 0.950 &lt; DPL 0.956 &lt;</w:t>
+        <w:t xml:space="preserve">Figure 4-30, the peak mid-point temperatures order as Fourier 0.950 &lt; DPL 0.956 &lt;</w:t>
       </w:r>
       <w:r>
         <w:t xml:space="preserve"> </w:t>
@@ -6951,8 +7079,8 @@
         <w:t xml:space="preserve">contributions of this research.</w:t>
       </w:r>
     </w:p>
-    <w:bookmarkEnd w:id="115"/>
-    <w:bookmarkStart w:id="116" w:name="chapter-summary"/>
+    <w:bookmarkEnd w:id="120"/>
+    <w:bookmarkStart w:id="121" w:name="chapter-summary"/>
     <w:p>
       <w:pPr>
         <w:pStyle w:val="Heading2"/>
@@ -7239,8 +7367,8 @@
         <w:t xml:space="preserve">theories diverge for this class of structures.</w:t>
       </w:r>
     </w:p>
-    <w:bookmarkEnd w:id="116"/>
-    <w:bookmarkEnd w:id="117"/>
+    <w:bookmarkEnd w:id="121"/>
+    <w:bookmarkEnd w:id="122"/>
     <w:sectPr>
       <w:footnotePr>
         <w:numRestart w:val="eachSect"/>

</xml_diff>

<commit_message>
Ch4 R4.4: update best/worst figure (Fig 4-24) per Prom 5 feedback
- Legend: removed the parenthetical descriptors; bare combo names now (UD-UD, V-A,
  A-UD, X-V, O-A). Best/worst is spelled out in the caption and the section 4-13 text.
- Added the best-mechanical case. By the inner-surface hoop stress criterion (as used
  in section 4-5) V-A is best mechanically too - already shown as best thermal - so the
  SECOND-best mechanical, O-A, was added (it is also the second-best thermal).
- Figure re-rendered (5 curves, B&W + colour); caption + EN/FA prose updated to the
  inner-surface hoop criterion; 4 docx rebuilt (30 figures). R4.3 kept frozen.

Co-Authored-By: Claude Opus 4.8 (1M context) <noreply@anthropic.com>
</commit_message>
<xml_diff>
--- a/claude/thesis_chapter/RESULTS_CHAPTER_EN_R4.4_bw.docx
+++ b/claude/thesis_chapter/RESULTS_CHAPTER_EN_R4.4_bw.docx
@@ -5707,7 +5707,7 @@
         <w:t xml:space="preserve"> </w:t>
       </w:r>
       <w:r>
-        <w:t xml:space="preserve">To distil the interaction into a single view, Figure 4-24 draws the extreme combinations together against the UD-UD reference: the best thermal case V-A, which holds the outer-surface temperature at T* = 0.034, the worst thermal case A-UD (0.896), and the worst mechanical case X-V, whose peak hoop stress reaches 4.20 — while the UD-UD reference is itself the best mechanical case (lowest peak hoop, 2.11). The figure makes the design trade-off explicit: V-A minimizes the outer-surface temperature at the price of a larger displacement, whereas X-V is benign thermally but the most highly stressed of all twenty-five combinations.</w:t>
+        <w:t xml:space="preserve">To distil the interaction into a single view, Figure 4-24 draws the extreme combinations together against the UD-UD reference. In thermal terms the best case is V-A (outer-surface T* = 0.034) and the worst is A-UD (0.896); in mechanical terms, measured by the inner-surface hoop stress as in Section 4-5, the best case is again V-A (a mild compressive −0.38) and the worst is X-V (4.15). Because V-A is optimal on both counts, the second-best mechanical case O-A (−0.37, which is also the second-best thermal case at T* = 0.064) is added as the next practical option. The figure makes the design trade-off explicit: the porosity-A combinations V-A and O-A minimize both the outer-surface temperature and the inner-surface stress, whereas X-V is thermally mild but by far the most highly stressed of all twenty-five combinations.</w:t>
       </w:r>
     </w:p>
     <w:p>
@@ -5731,7 +5731,7 @@
           <wp:inline>
             <wp:extent cx="5334000" cy="3708431"/>
             <wp:effectExtent b="0" l="0" r="0" t="0"/>
-            <wp:docPr descr="Figure 4-24: Best and worst GPL x porosity combinations in thermal and mechanical terms: V-A (best thermal, outer T*=0.034), A-UD (worst thermal, 0.896) and X-V (worst hoop stress, 4.20), against the UD-UD reference (best mechanical, peak hoop 2.11) [R_i=1, R_o=1.5, L=2.1 m, N_L=7, W_GPL=0.3%, e_m3=0.8604, τ*=0.15, P_i=50 MPa, simply supported]" title="" id="95" name="Picture"/>
+            <wp:docPr descr="Figure 4-24: Best and worst GPL x porosity combinations against the UD-UD reference: V-A (best thermal, outer T*=0.034, and best mechanical by inner-surface hoop stress, -0.38), A-UD (worst thermal, 0.896), X-V (worst mechanical, inner hoop 4.15), and O-A (second-best mechanical, -0.37) [R_i=1, R_o=1.5, L=2.1 m, N_L=7, W_GPL=0.3%, e_m3=0.8604, τ*=0.15, P_i=50 MPa, simply supported]" title="" id="95" name="Picture"/>
             <a:graphic>
               <a:graphicData uri="http://schemas.openxmlformats.org/drawingml/2006/picture">
                 <pic:pic>

</xml_diff>

<commit_message>
Ch4 R4.4: expand section 4-13 (GPL x porosity interaction) per Prom 5
- Added a paragraph reading the five per-porosity figures together: the GPL ordering
  (V < O < UD/X < A) is preserved at every porosity background, showing the graphene
  and porosity act through independent channels; the spread between the curves widens
  against porosity-A (outer barrier + conductive inner GPL reinforce) and narrows
  against UD/V porosities; the hoop-stress staircases follow the same logic.
- Added a paragraph reading Fig 4-24 (best/worst) as a design chart: V-A/O-A the
  favourable corner, A-UD worst thermal, X-V the mechanical cautionary case (hoop 4.20
  though only mildly hot), UD-UD a safe mechanical baseline; ends with the design
  recommendation (outer-porosity-A + inner-rich GPL; avoid stiff-GPL + inner-porosity).
- EN + FA; 4 docx rebuilt (30 figures). R4.3 kept frozen.

Co-Authored-By: Claude Opus 4.8 (1M context) <noreply@anthropic.com>
</commit_message>
<xml_diff>
--- a/claude/thesis_chapter/RESULTS_CHAPTER_EN_R4.4_bw.docx
+++ b/claude/thesis_chapter/RESULTS_CHAPTER_EN_R4.4_bw.docx
@@ -2,7 +2,7 @@
 <file path=word/document.xml><?xml version="1.0" encoding="utf-8"?>
 <w:document xmlns:w="http://schemas.openxmlformats.org/wordprocessingml/2006/main" xmlns:m="http://schemas.openxmlformats.org/officeDocument/2006/math" xmlns:r="http://schemas.openxmlformats.org/officeDocument/2006/relationships" xmlns:o="urn:schemas-microsoft-com:office:office" xmlns:v="urn:schemas-microsoft-com:vml" xmlns:w10="urn:schemas-microsoft-com:office:word" xmlns:a="http://schemas.openxmlformats.org/drawingml/2006/main" xmlns:pic="http://schemas.openxmlformats.org/drawingml/2006/picture" xmlns:wp="http://schemas.openxmlformats.org/drawingml/2006/wordprocessingDrawing">
   <w:body>
-    <w:bookmarkStart w:id="122" w:name="chapter-4-research-findings"/>
+    <w:bookmarkStart w:id="123" w:name="chapter-4-research-findings"/>
     <w:p>
       <w:pPr>
         <w:pStyle w:val="Heading1"/>
@@ -5013,7 +5013,7 @@
       </w:r>
     </w:p>
     <w:bookmarkEnd w:id="72"/>
-    <w:bookmarkStart w:id="100" w:name="X81eac57fafad65e87a08e7444e513955d528acd"/>
+    <w:bookmarkStart w:id="97" w:name="X81eac57fafad65e87a08e7444e513955d528acd"/>
     <w:p>
       <w:pPr>
         <w:pStyle w:val="Heading2"/>
@@ -5659,7 +5659,7 @@
     </w:p>
     <w:p>
       <w:pPr>
-        <w:pStyle w:val="BodyText"/>
+        <w:pStyle w:val="CaptionedFigure"/>
       </w:pPr>
       <w:r>
         <w:drawing>
@@ -5703,9 +5703,27 @@
           </wp:inline>
         </w:drawing>
       </w:r>
-      <w:r>
-        <w:t xml:space="preserve"> </w:t>
-      </w:r>
+    </w:p>
+    <w:p>
+      <w:pPr>
+        <w:pStyle w:val="ImageCaption"/>
+      </w:pPr>
+      <w:r>
+        <w:t xml:space="preserve">Figure 4-23: GPL pattern comparison (UD, O, X, V, A) at A-type porosity [R_i=1, R_o=1.5, L=2.1 m, N_L=7, W_GPL=0.3%, e_m3=0.8604, A porosity, τ*=0.15, P_i=50 MPa, simply supported]</w:t>
+      </w:r>
+    </w:p>
+    <w:p>
+      <w:pPr>
+        <w:pStyle w:val="BodyText"/>
+      </w:pPr>
+      <w:r>
+        <w:t xml:space="preserve">Read side by side, the five per-porosity figures separate the two mechanisms cleanly. In every background the ordering of the GPL patterns by outer-surface temperature is the same — V the coolest, then O, then UD and X, with A the hottest — which shows that the graphene pattern and the porosity pattern act through largely independent channels: the graphene sets how quickly heat is conducted across the thickness, while the porosity sets how much of it is blocked near the outer wall. What changes from one figure to the next is the spread between the five curves. Against the uniform (UD) or inner-concentrated (V) porosities the curves stay bunched, because those pore distributions do little to impede the outward heat flow, so the choice of graphene pattern matters least there. Against the outer-concentrated porosity-A the curves fan apart and every one of them falls to a very low outer-surface temperature, because the outer pore barrier and a conductive inner graphene layer reinforce one another — this is the background on which the graphene pattern pays off most. The hoop-stress profiles follow the same logic: the gentlest interface staircases belong to the GPL-V backgrounds, where the stiff conductive phase sits exactly where the temperature gradient is steepest, while the steepest jumps appear for the inner-concentrated porosity-V, which piles both the thermal load and the compliant, pore-rich material at the heated inner surface.</w:t>
+      </w:r>
+    </w:p>
+    <w:p>
+      <w:pPr>
+        <w:pStyle w:val="BodyText"/>
+      </w:pPr>
       <w:r>
         <w:t xml:space="preserve">To distil the interaction into a single view, Figure 4-24 draws the extreme combinations together against the UD-UD reference. In thermal terms the best case is V-A (outer-surface T* = 0.034) and the worst is A-UD (0.896); in mechanical terms, measured by the inner-surface hoop stress as in Section 4-5, the best case is again V-A (a mild compressive −0.38) and the worst is X-V (4.15). Because V-A is optimal on both counts, the second-best mechanical case O-A (−0.37, which is also the second-best thermal case at T* = 0.064) is added as the next practical option. The figure makes the design trade-off explicit: the porosity-A combinations V-A and O-A minimize both the outer-surface temperature and the inner-surface stress, whereas X-V is thermally mild but by far the most highly stressed of all twenty-five combinations.</w:t>
       </w:r>
@@ -5724,7 +5742,7 @@
     </w:p>
     <w:p>
       <w:pPr>
-        <w:pStyle w:val="BodyText"/>
+        <w:pStyle w:val="CaptionedFigure"/>
       </w:pPr>
       <w:r>
         <w:drawing>
@@ -5768,16 +5786,36 @@
           </wp:inline>
         </w:drawing>
       </w:r>
-      <w:r>
-        <w:t xml:space="preserve"> </w:t>
-      </w:r>
-      <w:r>
-        <w:t xml:space="preserve">## 4-14. Effect of the coupling of the equations</w:t>
+    </w:p>
+    <w:p>
+      <w:pPr>
+        <w:pStyle w:val="ImageCaption"/>
+      </w:pPr>
+      <w:r>
+        <w:t xml:space="preserve">Figure 4-24: Best and worst GPL x porosity combinations against the UD-UD reference: V-A (best thermal, outer T*=0.034, and best mechanical by inner-surface hoop stress, -0.38), A-UD (worst thermal, 0.896), X-V (worst mechanical, inner hoop 4.15), and O-A (second-best mechanical, -0.37) [R_i=1, R_o=1.5, L=2.1 m, N_L=7, W_GPL=0.3%, e_m3=0.8604, τ*=0.15, P_i=50 MPa, simply supported]</w:t>
       </w:r>
     </w:p>
     <w:p>
       <w:pPr>
         <w:pStyle w:val="BodyText"/>
+      </w:pPr>
+      <w:r>
+        <w:t xml:space="preserve">Read as a design chart, Figure 4-24 marks the corners of the achievable envelope. The two porosity-A cases V-A and O-A occupy the favourable corner: both hold the outer surface below T* = 0.07 and keep the inner-surface hoop stress mildly compressive, so they are the natural choice wherever thermal protection is the objective and the slightly larger radial displacement they carry is acceptable. The worst-thermal case A-UD sits at the opposite corner — a conductive-outer graphene layer with no outer pore barrier lets the heat reach the outer wall almost unimpeded. The worst-mechanical case X-V is the cautionary one: it is only moderately hot, so a temperature-only screening would pass it, yet the combination of a stiff X-graphene skeleton with an inner-concentrated porosity drives the hoop stress to 4.20 — nearly twice the reference and the largest of all twenty-five combinations — a reminder that the pattern pair must be checked for stress as well as for temperature. The reference UD-UD lies in the interior of the chart, unremarkable thermally but, with the lowest peak stress, a safe mechanical baseline. The practical conclusion is that an outer-concentrated porosity-A paired with an inner-rich graphene pattern (V or O) is the recommended design for internal thermal shock, whereas any pairing of a stiff graphene pattern with an inner-concentrated porosity should be avoided.</w:t>
+      </w:r>
+    </w:p>
+    <w:bookmarkEnd w:id="97"/>
+    <w:bookmarkStart w:id="101" w:name="effect-of-the-coupling-of-the-equations"/>
+    <w:p>
+      <w:pPr>
+        <w:pStyle w:val="Heading2"/>
+      </w:pPr>
+      <w:r>
+        <w:t xml:space="preserve">4-14. Effect of the coupling of the equations</w:t>
+      </w:r>
+    </w:p>
+    <w:p>
+      <w:pPr>
+        <w:pStyle w:val="FirstParagraph"/>
       </w:pPr>
       <w:r>
         <w:rPr>
@@ -5796,18 +5834,18 @@
           <wp:inline>
             <wp:extent cx="5334000" cy="3708431"/>
             <wp:effectExtent b="0" l="0" r="0" t="0"/>
-            <wp:docPr descr="Figure 4-25: Effect of thermo-mechanical coupling — fully coupled versus uncoupled energy equation [R_o/R_i=1.5, L=2.1 m, N_L=7, W_GPL=0.3%, e_m3=0.8604, τ*=0.15, P_i=50 MPa, simply supported]" title="" id="98" name="Picture"/>
+            <wp:docPr descr="Figure 4-25: Effect of thermo-mechanical coupling — fully coupled versus uncoupled energy equation [R_o/R_i=1.5, L=2.1 m, N_L=7, W_GPL=0.3%, e_m3=0.8604, τ*=0.15, P_i=50 MPa, simply supported]" title="" id="99" name="Picture"/>
             <a:graphic>
               <a:graphicData uri="http://schemas.openxmlformats.org/drawingml/2006/picture">
                 <pic:pic>
                   <pic:nvPicPr>
-                    <pic:cNvPr descr="figures_ch4_bw/I_coupling.png" id="99" name="Picture"/>
+                    <pic:cNvPr descr="figures_ch4_bw/I_coupling.png" id="100" name="Picture"/>
                     <pic:cNvPicPr>
                       <a:picLocks noChangeArrowheads="1" noChangeAspect="1"/>
                     </pic:cNvPicPr>
                   </pic:nvPicPr>
                   <pic:blipFill>
-                    <a:blip r:embed="rId97"/>
+                    <a:blip r:embed="rId98"/>
                     <a:stretch>
                       <a:fillRect/>
                     </a:stretch>
@@ -5904,8 +5942,8 @@
         <w:t xml:space="preserve">should be solved when the wave signature matters, despite its higher cost.</w:t>
       </w:r>
     </w:p>
-    <w:bookmarkEnd w:id="100"/>
-    <w:bookmarkStart w:id="104" w:name="Xb006e1994140170e308a706d86645cac631d9cb"/>
+    <w:bookmarkEnd w:id="101"/>
+    <w:bookmarkStart w:id="105" w:name="Xb006e1994140170e308a706d86645cac631d9cb"/>
     <w:p>
       <w:pPr>
         <w:pStyle w:val="Heading2"/>
@@ -5935,18 +5973,18 @@
           <wp:inline>
             <wp:extent cx="5334000" cy="3708431"/>
             <wp:effectExtent b="0" l="0" r="0" t="0"/>
-            <wp:docPr descr="Figure 4-26: Effect of the outer-surface convection coefficient h_c = 10 / 100 / 1000 W/m²K [R_o/R_i=1.5, L=2.1 m, N_L=7, W_GPL=0.3%, e_m3=0.8604, τ*=0.15, P_i=50 MPa, simply supported]" title="" id="102" name="Picture"/>
+            <wp:docPr descr="Figure 4-26: Effect of the outer-surface convection coefficient h_c = 10 / 100 / 1000 W/m²K [R_o/R_i=1.5, L=2.1 m, N_L=7, W_GPL=0.3%, e_m3=0.8604, τ*=0.15, P_i=50 MPa, simply supported]" title="" id="103" name="Picture"/>
             <a:graphic>
               <a:graphicData uri="http://schemas.openxmlformats.org/drawingml/2006/picture">
                 <pic:pic>
                   <pic:nvPicPr>
-                    <pic:cNvPr descr="figures_ch4_bw/J_convection.png" id="103" name="Picture"/>
+                    <pic:cNvPr descr="figures_ch4_bw/J_convection.png" id="104" name="Picture"/>
                     <pic:cNvPicPr>
                       <a:picLocks noChangeArrowheads="1" noChangeAspect="1"/>
                     </pic:cNvPicPr>
                   </pic:nvPicPr>
                   <pic:blipFill>
-                    <a:blip r:embed="rId101"/>
+                    <a:blip r:embed="rId102"/>
                     <a:stretch>
                       <a:fillRect/>
                     </a:stretch>
@@ -6043,8 +6081,8 @@
         <w:t xml:space="preserve">distinguished in design.</w:t>
       </w:r>
     </w:p>
-    <w:bookmarkEnd w:id="104"/>
-    <w:bookmarkStart w:id="108" w:name="effect-of-the-wall-thickness"/>
+    <w:bookmarkEnd w:id="105"/>
+    <w:bookmarkStart w:id="109" w:name="effect-of-the-wall-thickness"/>
     <w:p>
       <w:pPr>
         <w:pStyle w:val="Heading2"/>
@@ -6074,18 +6112,18 @@
           <wp:inline>
             <wp:extent cx="5334000" cy="3297867"/>
             <wp:effectExtent b="0" l="0" r="0" t="0"/>
-            <wp:docPr descr="Figure 4-27: Effect of the wall thickness, radius ratio R_o/R_i = 1.25 / 1.5 / 2.0 (inner radius fixed at 1 m) [L=2.1 m, N_L=7, W_GPL=0.3%, e_m3=0.8604, τ*=0.15, P_i=50 MPa, simply supported]" title="" id="106" name="Picture"/>
+            <wp:docPr descr="Figure 4-27: Effect of the wall thickness, radius ratio R_o/R_i = 1.25 / 1.5 / 2.0 (inner radius fixed at 1 m) [L=2.1 m, N_L=7, W_GPL=0.3%, e_m3=0.8604, τ*=0.15, P_i=50 MPa, simply supported]" title="" id="107" name="Picture"/>
             <a:graphic>
               <a:graphicData uri="http://schemas.openxmlformats.org/drawingml/2006/picture">
                 <pic:pic>
                   <pic:nvPicPr>
-                    <pic:cNvPr descr="figures_ch4_bw/K_thickness.png" id="107" name="Picture"/>
+                    <pic:cNvPr descr="figures_ch4_bw/K_thickness.png" id="108" name="Picture"/>
                     <pic:cNvPicPr>
                       <a:picLocks noChangeArrowheads="1" noChangeAspect="1"/>
                     </pic:cNvPicPr>
                   </pic:nvPicPr>
                   <pic:blipFill>
-                    <a:blip r:embed="rId105"/>
+                    <a:blip r:embed="rId106"/>
                     <a:stretch>
                       <a:fillRect/>
                     </a:stretch>
@@ -6200,8 +6238,8 @@
         <w:t xml:space="preserve">against a large, mildly stressed but strongly compressive thick wall.</w:t>
       </w:r>
     </w:p>
-    <w:bookmarkEnd w:id="108"/>
-    <w:bookmarkStart w:id="112" w:name="response-to-a-gaussian-thermal-shock"/>
+    <w:bookmarkEnd w:id="109"/>
+    <w:bookmarkStart w:id="113" w:name="response-to-a-gaussian-thermal-shock"/>
     <w:p>
       <w:pPr>
         <w:pStyle w:val="Heading2"/>
@@ -6231,18 +6269,18 @@
           <wp:inline>
             <wp:extent cx="5334000" cy="3708431"/>
             <wp:effectExtent b="0" l="0" r="0" t="0"/>
-            <wp:docPr descr="Figure 4-28: Response to a Gaussian thermal shock — Lord–Shulman versus Fourier [R_o/R_i=1.5, L=2.1 m, N_L=7, W_GPL=0.3%, e_m3=0.8604, P_i=50 MPa, simply supported]" title="" id="110" name="Picture"/>
+            <wp:docPr descr="Figure 4-28: Response to a Gaussian thermal shock — Lord–Shulman versus Fourier [R_o/R_i=1.5, L=2.1 m, N_L=7, W_GPL=0.3%, e_m3=0.8604, P_i=50 MPa, simply supported]" title="" id="111" name="Picture"/>
             <a:graphic>
               <a:graphicData uri="http://schemas.openxmlformats.org/drawingml/2006/picture">
                 <pic:pic>
                   <pic:nvPicPr>
-                    <pic:cNvPr descr="figures_ch4_bw/M_gauss_shock.png" id="111" name="Picture"/>
+                    <pic:cNvPr descr="figures_ch4_bw/M_gauss_shock.png" id="112" name="Picture"/>
                     <pic:cNvPicPr>
                       <a:picLocks noChangeArrowheads="1" noChangeAspect="1"/>
                     </pic:cNvPicPr>
                   </pic:nvPicPr>
                   <pic:blipFill>
-                    <a:blip r:embed="rId109"/>
+                    <a:blip r:embed="rId110"/>
                     <a:stretch>
                       <a:fillRect/>
                     </a:stretch>
@@ -6357,8 +6395,8 @@
         <w:t xml:space="preserve">of the shock — a strong argument in favor of the generalized theory.</w:t>
       </w:r>
     </w:p>
-    <w:bookmarkEnd w:id="112"/>
-    <w:bookmarkStart w:id="113" w:name="comparison-of-time-integration-methods"/>
+    <w:bookmarkEnd w:id="113"/>
+    <w:bookmarkStart w:id="114" w:name="comparison-of-time-integration-methods"/>
     <w:p>
       <w:pPr>
         <w:pStyle w:val="Heading2"/>
@@ -6727,8 +6765,8 @@
         <w:t xml:space="preserve">method for all production runs of this thesis.</w:t>
       </w:r>
     </w:p>
-    <w:bookmarkEnd w:id="113"/>
-    <w:bookmarkStart w:id="120" w:name="X9c9188b738b4478e05baa4d1b661521d9ddb445"/>
+    <w:bookmarkEnd w:id="114"/>
+    <w:bookmarkStart w:id="121" w:name="X9c9188b738b4478e05baa4d1b661521d9ddb445"/>
     <w:p>
       <w:pPr>
         <w:pStyle w:val="Heading2"/>
@@ -6870,18 +6908,18 @@
           <wp:inline>
             <wp:extent cx="5334000" cy="3828753"/>
             <wp:effectExtent b="0" l="0" r="0" t="0"/>
-            <wp:docPr descr="Figure 4-29: Spatial-discretization convergence on the transient-conduction benchmark: maximum error versus number of radial nodes N for DQM (Chebyshev and uniform), 2nd-order FDM, and linear/quadratic FEM; the dotted line marks slope -2 (second-order convergence)" title="" id="115" name="Picture"/>
+            <wp:docPr descr="Figure 4-29: Spatial-discretization convergence on the transient-conduction benchmark: maximum error versus number of radial nodes N for DQM (Chebyshev and uniform), 2nd-order FDM, and linear/quadratic FEM; the dotted line marks slope -2 (second-order convergence)" title="" id="116" name="Picture"/>
             <a:graphic>
               <a:graphicData uri="http://schemas.openxmlformats.org/drawingml/2006/picture">
                 <pic:pic>
                   <pic:nvPicPr>
-                    <pic:cNvPr descr="figures_ch4_bw/spatial_convergence.png" id="116" name="Picture"/>
+                    <pic:cNvPr descr="figures_ch4_bw/spatial_convergence.png" id="117" name="Picture"/>
                     <pic:cNvPicPr>
                       <a:picLocks noChangeArrowheads="1" noChangeAspect="1"/>
                     </pic:cNvPicPr>
                   </pic:nvPicPr>
                   <pic:blipFill>
-                    <a:blip r:embed="rId114"/>
+                    <a:blip r:embed="rId115"/>
                     <a:stretch>
                       <a:fillRect/>
                     </a:stretch>
@@ -6935,18 +6973,18 @@
           <wp:inline>
             <wp:extent cx="5334000" cy="3708431"/>
             <wp:effectExtent b="0" l="0" r="0" t="0"/>
-            <wp:docPr descr="Figure 4-30: Comparison of the generalized thermoelasticity theories — Fourier, Lord–Shulman, dual-phase-lag and Green–Naghdi III [R_o/R_i=1.5, L=2.1 m, N_L=7, W_GPL=0.3%, e_m3=0.8604, τ*=0.15, P_i=50 MPa, simply supported]" title="" id="118" name="Picture"/>
+            <wp:docPr descr="Figure 4-30: Comparison of the generalized thermoelasticity theories — Fourier, Lord–Shulman, dual-phase-lag and Green–Naghdi III [R_o/R_i=1.5, L=2.1 m, N_L=7, W_GPL=0.3%, e_m3=0.8604, τ*=0.15, P_i=50 MPa, simply supported]" title="" id="119" name="Picture"/>
             <a:graphic>
               <a:graphicData uri="http://schemas.openxmlformats.org/drawingml/2006/picture">
                 <pic:pic>
                   <pic:nvPicPr>
-                    <pic:cNvPr descr="figures_ch4_bw/T3_theories.png" id="119" name="Picture"/>
+                    <pic:cNvPr descr="figures_ch4_bw/T3_theories.png" id="120" name="Picture"/>
                     <pic:cNvPicPr>
                       <a:picLocks noChangeArrowheads="1" noChangeAspect="1"/>
                     </pic:cNvPicPr>
                   </pic:nvPicPr>
                   <pic:blipFill>
-                    <a:blip r:embed="rId117"/>
+                    <a:blip r:embed="rId118"/>
                     <a:stretch>
                       <a:fillRect/>
                     </a:stretch>
@@ -7079,8 +7117,8 @@
         <w:t xml:space="preserve">contributions of this research.</w:t>
       </w:r>
     </w:p>
-    <w:bookmarkEnd w:id="120"/>
-    <w:bookmarkStart w:id="121" w:name="chapter-summary"/>
+    <w:bookmarkEnd w:id="121"/>
+    <w:bookmarkStart w:id="122" w:name="chapter-summary"/>
     <w:p>
       <w:pPr>
         <w:pStyle w:val="Heading2"/>
@@ -7367,8 +7405,8 @@
         <w:t xml:space="preserve">theories diverge for this class of structures.</w:t>
       </w:r>
     </w:p>
-    <w:bookmarkEnd w:id="121"/>
     <w:bookmarkEnd w:id="122"/>
+    <w:bookmarkEnd w:id="123"/>
     <w:sectPr>
       <w:footnotePr>
         <w:numRestart w:val="eachSect"/>

</xml_diff>